<commit_message>
Rapport technique : lien GitHub et chemin de SOURCES.md
</commit_message>
<xml_diff>
--- a/docs/rapport_technique/MinorShield_Policy_Lab_Rapport_technique_FR.docx
+++ b/docs/rapport_technique/MinorShield_Policy_Lab_Rapport_technique_FR.docx
@@ -76,8 +76,20 @@
           <w:color w:val="000000" w:themeColor="text1"/>
           <w:sz w:val="21"/>
         </w:rPr>
-        <w:t>Lien GitHub : [à ajouter après publication]</w:t>
-      </w:r>
+        <w:t xml:space="preserve">Lien GitHub : </w:t>
+      </w:r>
+      <w:hyperlink r:id="rId8">
+        <w:r>
+          <w:rPr>
+            <w:rFonts w:ascii="Times New Roman" w:hAnsi="Times New Roman" w:eastAsia="Times New Roman"/>
+            <w:color w:val="000000" w:themeColor="text1"/>
+            <w:sz w:val="21"/>
+            <w:color w:val="0563C1"/>
+            <w:u w:val="single"/>
+          </w:rPr>
+          <w:t xml:space="preserve">https://github.com/oumarouabdoulhamid26-svg/MinorShield-Hackathon</w:t>
+        </w:r>
+      </w:hyperlink>
     </w:p>
     <w:p>
       <w:pPr>
@@ -1032,7 +1044,7 @@
                 <w:rFonts w:ascii="Times New Roman" w:hAnsi="Times New Roman" w:eastAsia="Times New Roman"/>
                 <w:sz w:val="17"/>
               </w:rPr>
-              <w:t>Code de référence UIT (ITUAIReadiness, licence MIT) ; registre de provenance (docs/SOURCES.md)</w:t>
+              <w:t>Code de référence UIT (ITUAIReadiness, licence MIT) ; registre de provenance (bd/SOURCES.md)</w:t>
             </w:r>
           </w:p>
         </w:tc>

</xml_diff>